<commit_message>
feat(web): bases de backend en MySQL con DB_MOTOR y material por semana
- Semana 8: andamiaje de db-local.js con mysql2, schema-usuarios.sql para
  MySQL (SET NAMES utf8mb4) y .env.example.
- Semana 9: models/motor.js y usuarios.model.js eligen el modelo con
  DB_MOTOR (mysql en local, supabase al publicar); usuarios.model.supabase.js
  vacio para el alumno.
- Semana 10: schema-completo-mysql.sql con todas las tablas y el admin semilla.
- Semana 14: dashboard.model.js elige con DB_MOTOR; versiones mysql y
  supabase vacias para el alumno.
- README (y .docx) de las semanas 6-10, 13 y 14: seccion "Material de esta
  semana" con lo que viene hecho y lo que escribe el alumno, incluida la
  validacion de datos en el backend.

Co-Authored-By: Claude Opus 5.5 <noreply@anthropic.com>
</commit_message>
<xml_diff>
--- a/parcial-2-bd-supabase-auth/semana-06/README.docx
+++ b/parcial-2-bd-supabase-auth/semana-06/README.docx
@@ -2,7 +2,7 @@
 <file path=word/document.xml><?xml version="1.0" encoding="utf-8"?>
 <w:document xmlns:w="http://schemas.openxmlformats.org/wordprocessingml/2006/main" xmlns:m="http://schemas.openxmlformats.org/officeDocument/2006/math" xmlns:r="http://schemas.openxmlformats.org/officeDocument/2006/relationships" xmlns:o="urn:schemas-microsoft-com:office:office" xmlns:v="urn:schemas-microsoft-com:vml" xmlns:w10="urn:schemas-microsoft-com:office:word" xmlns:a="http://schemas.openxmlformats.org/drawingml/2006/main" xmlns:pic="http://schemas.openxmlformats.org/drawingml/2006/picture" xmlns:wp="http://schemas.openxmlformats.org/drawingml/2006/wordprocessingDrawing">
   <w:body>
-    <w:bookmarkStart w:id="9" w:name="semana-6-28-sep-2-oct--programación-web"/>
+    <w:bookmarkStart w:id="9" w:name="semana-6-28-sep-2-oct-programación-web"/>
     <w:p>
       <w:pPr>
         <w:pStyle w:val="Heading1"/>
@@ -174,22 +174,198 @@
           <w:b/>
           <w:bCs/>
         </w:rPr>
-        <w:t xml:space="preserve">Archivos base:</w:t>
-      </w:r>
-      <w:r>
-        <w:t xml:space="preserve"> </w:t>
-      </w:r>
-      <w:r>
-        <w:rPr>
-          <w:rStyle w:val="VerbatimChar"/>
-        </w:rPr>
-        <w:t xml:space="preserve">base/mini-servidor-express/</w:t>
-      </w:r>
-      <w:r>
-        <w:t xml:space="preserve"> </w:t>
-      </w:r>
-      <w:r>
-        <w:t xml:space="preserve">(Express vacío,</w:t>
+        <w:t xml:space="preserve">Material de esta semana (</w:t>
+      </w:r>
+      <w:r>
+        <w:rPr>
+          <w:rStyle w:val="VerbatimChar"/>
+          <w:b/>
+          <w:bCs/>
+        </w:rPr>
+        <w:t xml:space="preserve">base/</w:t>
+      </w:r>
+      <w:r>
+        <w:rPr>
+          <w:b/>
+          <w:bCs/>
+        </w:rPr>
+        <w:t xml:space="preserve">):</w:t>
+      </w:r>
+      <w:r>
+        <w:t xml:space="preserve"> </w:t>
+      </w:r>
+      <w:r>
+        <w:t xml:space="preserve">-</w:t>
+      </w:r>
+      <w:r>
+        <w:t xml:space="preserve"> </w:t>
+      </w:r>
+      <w:r>
+        <w:rPr>
+          <w:rStyle w:val="VerbatimChar"/>
+        </w:rPr>
+        <w:t xml:space="preserve">mini-proyecto-next/</w:t>
+      </w:r>
+      <w:r>
+        <w:t xml:space="preserve">: el</w:t>
+      </w:r>
+      <w:r>
+        <w:t xml:space="preserve"> </w:t>
+      </w:r>
+      <w:r>
+        <w:rPr>
+          <w:b/>
+          <w:bCs/>
+        </w:rPr>
+        <w:t xml:space="preserve">kit de front</w:t>
+      </w:r>
+      <w:r>
+        <w:t xml:space="preserve"> </w:t>
+      </w:r>
+      <w:r>
+        <w:t xml:space="preserve">que usarás hasta la semana 15. Ya trae</w:t>
+      </w:r>
+      <w:r>
+        <w:t xml:space="preserve"> </w:t>
+      </w:r>
+      <w:r>
+        <w:rPr>
+          <w:rStyle w:val="VerbatimChar"/>
+        </w:rPr>
+        <w:t xml:space="preserve">package.json</w:t>
+      </w:r>
+      <w:r>
+        <w:t xml:space="preserve">, todo el CSS (</w:t>
+      </w:r>
+      <w:r>
+        <w:rPr>
+          <w:rStyle w:val="VerbatimChar"/>
+        </w:rPr>
+        <w:t xml:space="preserve">styles/globals.css</w:t>
+      </w:r>
+      <w:r>
+        <w:t xml:space="preserve">), el menú (</w:t>
+      </w:r>
+      <w:r>
+        <w:rPr>
+          <w:rStyle w:val="VerbatimChar"/>
+        </w:rPr>
+        <w:t xml:space="preserve">pages/_app.js</w:t>
+      </w:r>
+      <w:r>
+        <w:t xml:space="preserve">,</w:t>
+      </w:r>
+      <w:r>
+        <w:t xml:space="preserve"> </w:t>
+      </w:r>
+      <w:r>
+        <w:rPr>
+          <w:rStyle w:val="VerbatimChar"/>
+        </w:rPr>
+        <w:t xml:space="preserve">components/Menu.js</w:t>
+      </w:r>
+      <w:r>
+        <w:t xml:space="preserve">), el proxy al backend (</w:t>
+      </w:r>
+      <w:r>
+        <w:rPr>
+          <w:rStyle w:val="VerbatimChar"/>
+        </w:rPr>
+        <w:t xml:space="preserve">next.config.js</w:t>
+      </w:r>
+      <w:r>
+        <w:t xml:space="preserve">) y las validaciones (</w:t>
+      </w:r>
+      <w:r>
+        <w:rPr>
+          <w:rStyle w:val="VerbatimChar"/>
+        </w:rPr>
+        <w:t xml:space="preserve">lib/validaciones.js</w:t>
+      </w:r>
+      <w:r>
+        <w:t xml:space="preserve">).</w:t>
+      </w:r>
+      <w:r>
+        <w:t xml:space="preserve"> </w:t>
+      </w:r>
+      <w:r>
+        <w:rPr>
+          <w:b/>
+          <w:bCs/>
+        </w:rPr>
+        <w:t xml:space="preserve">No los modifiques.</w:t>
+      </w:r>
+      <w:r>
+        <w:t xml:space="preserve"> </w:t>
+      </w:r>
+      <w:r>
+        <w:t xml:space="preserve">- Tú escribes</w:t>
+      </w:r>
+      <w:r>
+        <w:t xml:space="preserve"> </w:t>
+      </w:r>
+      <w:r>
+        <w:rPr>
+          <w:rStyle w:val="VerbatimChar"/>
+        </w:rPr>
+        <w:t xml:space="preserve">pages/index.js</w:t>
+      </w:r>
+      <w:r>
+        <w:t xml:space="preserve"> </w:t>
+      </w:r>
+      <w:r>
+        <w:t xml:space="preserve">y</w:t>
+      </w:r>
+      <w:r>
+        <w:t xml:space="preserve"> </w:t>
+      </w:r>
+      <w:r>
+        <w:rPr>
+          <w:rStyle w:val="VerbatimChar"/>
+        </w:rPr>
+        <w:t xml:space="preserve">pages/practica/[id].js</w:t>
+      </w:r>
+      <w:r>
+        <w:t xml:space="preserve"> </w:t>
+      </w:r>
+      <w:r>
+        <w:t xml:space="preserve">(vienen vacíos).</w:t>
+      </w:r>
+      <w:r>
+        <w:t xml:space="preserve"> </w:t>
+      </w:r>
+      <w:r>
+        <w:t xml:space="preserve">-</w:t>
+      </w:r>
+      <w:r>
+        <w:t xml:space="preserve"> </w:t>
+      </w:r>
+      <w:r>
+        <w:rPr>
+          <w:rStyle w:val="VerbatimChar"/>
+        </w:rPr>
+        <w:t xml:space="preserve">mini-servidor-express/</w:t>
+      </w:r>
+      <w:r>
+        <w:t xml:space="preserve">: tú escribes tus 2 endpoints en</w:t>
+      </w:r>
+      <w:r>
+        <w:t xml:space="preserve"> </w:t>
+      </w:r>
+      <w:r>
+        <w:rPr>
+          <w:rStyle w:val="VerbatimChar"/>
+        </w:rPr>
+        <w:t xml:space="preserve">server.js</w:t>
+      </w:r>
+      <w:r>
+        <w:t xml:space="preserve">.</w:t>
+      </w:r>
+      <w:r>
+        <w:t xml:space="preserve"> </w:t>
+      </w:r>
+      <w:r>
+        <w:t xml:space="preserve">- Para arrancar:</w:t>
       </w:r>
       <w:r>
         <w:t xml:space="preserve"> </w:t>
@@ -204,22 +380,94 @@
         <w:t xml:space="preserve"> </w:t>
       </w:r>
       <w:r>
-        <w:t xml:space="preserve">y completa las rutas),</w:t>
-      </w:r>
-      <w:r>
-        <w:t xml:space="preserve"> </w:t>
-      </w:r>
-      <w:r>
-        <w:rPr>
-          <w:rStyle w:val="VerbatimChar"/>
-        </w:rPr>
-        <w:t xml:space="preserve">base/mini-proyecto-next/pages/practica/[id].js</w:t>
-      </w:r>
-      <w:r>
-        <w:t xml:space="preserve"> </w:t>
-      </w:r>
-      <w:r>
-        <w:t xml:space="preserve">(componente vacío).</w:t>
+        <w:t xml:space="preserve">y</w:t>
+      </w:r>
+      <w:r>
+        <w:t xml:space="preserve"> </w:t>
+      </w:r>
+      <w:r>
+        <w:rPr>
+          <w:rStyle w:val="VerbatimChar"/>
+        </w:rPr>
+        <w:t xml:space="preserve">npm run dev</w:t>
+      </w:r>
+      <w:r>
+        <w:t xml:space="preserve"> </w:t>
+      </w:r>
+      <w:r>
+        <w:t xml:space="preserve">dentro de</w:t>
+      </w:r>
+      <w:r>
+        <w:t xml:space="preserve"> </w:t>
+      </w:r>
+      <w:r>
+        <w:rPr>
+          <w:rStyle w:val="VerbatimChar"/>
+        </w:rPr>
+        <w:t xml:space="preserve">mini-proyecto-next/</w:t>
+      </w:r>
+      <w:r>
+        <w:t xml:space="preserve">;</w:t>
+      </w:r>
+      <w:r>
+        <w:t xml:space="preserve"> </w:t>
+      </w:r>
+      <w:r>
+        <w:rPr>
+          <w:rStyle w:val="VerbatimChar"/>
+        </w:rPr>
+        <w:t xml:space="preserve">npm install</w:t>
+      </w:r>
+      <w:r>
+        <w:t xml:space="preserve"> </w:t>
+      </w:r>
+      <w:r>
+        <w:t xml:space="preserve">y</w:t>
+      </w:r>
+      <w:r>
+        <w:t xml:space="preserve"> </w:t>
+      </w:r>
+      <w:r>
+        <w:rPr>
+          <w:rStyle w:val="VerbatimChar"/>
+        </w:rPr>
+        <w:t xml:space="preserve">npm start</w:t>
+      </w:r>
+      <w:r>
+        <w:t xml:space="preserve"> </w:t>
+      </w:r>
+      <w:r>
+        <w:t xml:space="preserve">dentro de</w:t>
+      </w:r>
+      <w:r>
+        <w:t xml:space="preserve"> </w:t>
+      </w:r>
+      <w:r>
+        <w:rPr>
+          <w:rStyle w:val="VerbatimChar"/>
+        </w:rPr>
+        <w:t xml:space="preserve">mini-servidor-express/</w:t>
+      </w:r>
+      <w:r>
+        <w:t xml:space="preserve">.</w:t>
+      </w:r>
+      <w:r>
+        <w:t xml:space="preserve"> </w:t>
+      </w:r>
+      <w:r>
+        <w:t xml:space="preserve">- Esta app es la única que usarás en el curso: cada semana copias encima los archivos nuevos de</w:t>
+      </w:r>
+      <w:r>
+        <w:t xml:space="preserve"> </w:t>
+      </w:r>
+      <w:r>
+        <w:rPr>
+          <w:rStyle w:val="VerbatimChar"/>
+        </w:rPr>
+        <w:t xml:space="preserve">base/mini-proyecto-next/</w:t>
+      </w:r>
+      <w:r>
+        <w:t xml:space="preserve">.</w:t>
       </w:r>
     </w:p>
     <w:p>

</xml_diff>